<commit_message>
docs: update progress, API and user guide for submission lifecycle
- PROGRESS: Phase 8 marked complete with 2026-07-10 and 2026-08-11
  change logs covering lifecycle, personal projects, roster grading,
  regression fixes and load test results
- API/SPECIFICATION/plans refreshed to match removed team endpoints and
  new submission status fields; user guide rebuilt to 43 pages with
  fresh screenshots
</commit_message>
<xml_diff>
--- a/docs/用户操作指南.docx
+++ b/docs/用户操作指南.docx
@@ -61,13 +61,7 @@
         <w:jc w:val="center"/>
       </w:pPr>
       <w:r>
-        <w:rPr>
-          <w:rFonts w:ascii="Microsoft YaHei" w:cs="Microsoft YaHei" w:eastAsia="Microsoft YaHei" w:hAnsi="Microsoft YaHei"/>
-          <w:color w:val="667085"/>
-          <w:sz w:val="20"/>
-          <w:szCs w:val="20"/>
-        </w:rPr>
-        <w:t xml:space="preserve">演练数据编号：0614111133</w:t>
+        <w:t>演练数据编号：0811134739（Docker 后端，30 名学生并发场景）</w:t>
       </w:r>
     </w:p>
     <w:p>
@@ -76,13 +70,7 @@
         <w:jc w:val="center"/>
       </w:pPr>
       <w:r>
-        <w:rPr>
-          <w:rFonts w:ascii="Microsoft YaHei" w:cs="Microsoft YaHei" w:eastAsia="Microsoft YaHei" w:hAnsi="Microsoft YaHei"/>
-          <w:color w:val="667085"/>
-          <w:sz w:val="20"/>
-          <w:szCs w:val="20"/>
-        </w:rPr>
-        <w:t xml:space="preserve">适用场景：学期初建班建课、课堂发布任务、学生提交、教师实时看板、课后批改、学生查看结果、课程资源、学生网盘、考试项目和成绩导出。</w:t>
+        <w:t>适用场景：学期初建班建课、课堂发布任务、学生提交、教师实时看板、课后按名单批改、退回重交、学生查看任务/考试/项目批改详情、课程资源、学生网盘和期末成绩导出。</w:t>
       </w:r>
     </w:p>
     <w:p>
@@ -111,7 +99,7 @@
           <wp:inline distT="0" distB="0" distL="0" distR="0">
             <wp:extent cx="5905500" cy="4105275"/>
             <wp:effectExtent t="0" r="0" b="0" l="0"/>
-            <wp:docPr id="1" name="00-login-smoke.png" descr="所有角色从同一个登录页进入：管理员/教师填用户名，学生填学号。" title="登录页"/>
+            <wp:docPr id="1" name="00-login-smoke.png" descr="界面截图：登录页"/>
             <wp:cNvGraphicFramePr>
               <a:graphicFrameLocks xmlns:a="http://schemas.openxmlformats.org/drawingml/2006/main" noChangeAspect="1"/>
             </wp:cNvGraphicFramePr>
@@ -255,6 +243,9 @@
         <w:gridCol w:w="7960"/>
       </w:tblGrid>
       <w:tr>
+        <w:trPr>
+          <w:tblHeader w:val="true"/>
+        </w:trPr>
         <w:tc>
           <w:tcPr>
             <w:tcW w:type="dxa" w:w="2500"/>
@@ -786,13 +777,7 @@
         <w:spacing w:after="30" w:before="30" w:line="310"/>
       </w:pPr>
       <w:r>
-        <w:rPr>
-          <w:rFonts w:ascii="Microsoft YaHei" w:cs="Microsoft YaHei" w:eastAsia="Microsoft YaHei" w:hAnsi="Microsoft YaHei"/>
-          <w:color w:val="172033"/>
-          <w:sz w:val="22"/>
-          <w:szCs w:val="22"/>
-        </w:rPr>
-        <w:t xml:space="preserve">学生只有提交并被教师批改后，才能看到完整批改详情。</w:t>
+        <w:t>学生提交后可在截止前修改；批改完成后提交锁定。教师退回并填写原因后，学生才能修改重交，并可查看退回原因。</w:t>
       </w:r>
     </w:p>
     <w:p>
@@ -850,6 +835,9 @@
         <w:gridCol w:w="2660"/>
       </w:tblGrid>
       <w:tr>
+        <w:trPr>
+          <w:tblHeader w:val="true"/>
+        </w:trPr>
         <w:tc>
           <w:tcPr>
             <w:tcW w:type="dxa" w:w="1500"/>
@@ -2001,6 +1989,9 @@
         <w:gridCol w:w="7860"/>
       </w:tblGrid>
       <w:tr>
+        <w:trPr>
+          <w:tblHeader w:val="true"/>
+        </w:trPr>
         <w:tc>
           <w:tcPr>
             <w:tcW w:type="dxa" w:w="2600"/>
@@ -2374,7 +2365,7 @@
           <wp:inline distT="0" distB="0" distL="0" distR="0">
             <wp:extent cx="6191250" cy="4295775"/>
             <wp:effectExtent t="0" r="0" b="0" l="0"/>
-            <wp:docPr id="1" name="guide-01-admin-overview.png" descr="管理员进入后台后先看整体数据，确认班级、教师、学生是否已准备好。" title="管理员：系统概览"/>
+            <wp:docPr id="1" name="guide-01-admin-overview.png" descr="界面截图：管理员：系统概览"/>
             <wp:cNvGraphicFramePr>
               <a:graphicFrameLocks xmlns:a="http://schemas.openxmlformats.org/drawingml/2006/main" noChangeAspect="1"/>
             </wp:cNvGraphicFramePr>
@@ -2450,7 +2441,7 @@
           <wp:inline distT="0" distB="0" distL="0" distR="0">
             <wp:extent cx="6191250" cy="4124325"/>
             <wp:effectExtent t="0" r="0" b="0" l="0"/>
-            <wp:docPr id="1" name="01-admin-class-roster.png" descr="班级是课程、学生名单、教师授权和批改统计的基础。" title="管理员：班级管理"/>
+            <wp:docPr id="1" name="01-admin-class-roster.png" descr="界面截图：管理员：班级管理"/>
             <wp:cNvGraphicFramePr>
               <a:graphicFrameLocks xmlns:a="http://schemas.openxmlformats.org/drawingml/2006/main" noChangeAspect="1"/>
             </wp:cNvGraphicFramePr>
@@ -2526,7 +2517,7 @@
           <wp:inline distT="0" distB="0" distL="0" distR="0">
             <wp:extent cx="6191250" cy="4124325"/>
             <wp:effectExtent t="0" r="0" b="0" l="0"/>
-            <wp:docPr id="1" name="02-admin-teacher-binding.png" descr="教师必须绑定班级，否则教师端无法看到对应班级学生。" title="管理员：教师管理与班级绑定"/>
+            <wp:docPr id="1" name="02-admin-teacher-binding.png" descr="界面截图：管理员：教师管理与班级绑定"/>
             <wp:cNvGraphicFramePr>
               <a:graphicFrameLocks xmlns:a="http://schemas.openxmlformats.org/drawingml/2006/main" noChangeAspect="1"/>
             </wp:cNvGraphicFramePr>
@@ -2602,7 +2593,7 @@
           <wp:inline distT="0" distB="0" distL="0" distR="0">
             <wp:extent cx="6191250" cy="4124325"/>
             <wp:effectExtent t="0" r="0" b="0" l="0"/>
-            <wp:docPr id="1" name="03-admin-student-list.png" descr="学生登录依赖学号；班级归属错误会影响课程可见性和批改名单。" title="管理员：学生管理"/>
+            <wp:docPr id="1" name="03-admin-student-list.png" descr="界面截图：管理员：学生管理"/>
             <wp:cNvGraphicFramePr>
               <a:graphicFrameLocks xmlns:a="http://schemas.openxmlformats.org/drawingml/2006/main" noChangeAspect="1"/>
             </wp:cNvGraphicFramePr>
@@ -2802,6 +2793,9 @@
         <w:gridCol w:w="4560"/>
       </w:tblGrid>
       <w:tr>
+        <w:trPr>
+          <w:tblHeader w:val="true"/>
+        </w:trPr>
         <w:tc>
           <w:tcPr>
             <w:tcW w:type="dxa" w:w="1700"/>
@@ -3644,7 +3638,7 @@
           <wp:inline distT="0" distB="0" distL="0" distR="0">
             <wp:extent cx="6191250" cy="4295775"/>
             <wp:effectExtent t="0" r="0" b="0" l="0"/>
-            <wp:docPr id="1" name="guide-04-teacher-home.png" descr="教师登录后先查看近期待办和课程入口。" title="教师：首页/工作台"/>
+            <wp:docPr id="1" name="guide-04-teacher-home.png" descr="界面截图：教师：首页/工作台"/>
             <wp:cNvGraphicFramePr>
               <a:graphicFrameLocks xmlns:a="http://schemas.openxmlformats.org/drawingml/2006/main" noChangeAspect="1"/>
             </wp:cNvGraphicFramePr>
@@ -3813,7 +3807,7 @@
           <wp:inline distT="0" distB="0" distL="0" distR="0">
             <wp:extent cx="6191250" cy="4295775"/>
             <wp:effectExtent t="0" r="0" b="0" l="0"/>
-            <wp:docPr id="1" name="guide-05-teacher-courses.png" descr="课程列表用于进入课程详情、维护课程封面和绑定班级。" title="教师：课程列表"/>
+            <wp:docPr id="1" name="guide-05-teacher-courses.png" descr="界面截图：教师：课程列表"/>
             <wp:cNvGraphicFramePr>
               <a:graphicFrameLocks xmlns:a="http://schemas.openxmlformats.org/drawingml/2006/main" noChangeAspect="1"/>
             </wp:cNvGraphicFramePr>
@@ -3889,7 +3883,7 @@
           <wp:inline distT="0" distB="0" distL="0" distR="0">
             <wp:extent cx="6191250" cy="4295775"/>
             <wp:effectExtent t="0" r="0" b="0" l="0"/>
-            <wp:docPr id="1" name="guide-06-teacher-course-detail.png" descr="课程详情中组织学期、课次、任务和资源。" title="教师：课程详情与学期课次"/>
+            <wp:docPr id="1" name="guide-06-teacher-course-detail.png" descr="界面截图：教师：课程详情与学期课次"/>
             <wp:cNvGraphicFramePr>
               <a:graphicFrameLocks xmlns:a="http://schemas.openxmlformats.org/drawingml/2006/main" noChangeAspect="1"/>
             </wp:cNvGraphicFramePr>
@@ -4058,7 +4052,7 @@
           <wp:inline distT="0" distB="0" distL="0" distR="0">
             <wp:extent cx="6191250" cy="4295775"/>
             <wp:effectExtent t="0" r="0" b="0" l="0"/>
-            <wp:docPr id="1" name="guide-18-teacher-course-resources.png" descr="教师可以在课程资源中建立文件夹并上传课程资料。" title="教师：课程资源管理"/>
+            <wp:docPr id="1" name="guide-18-teacher-course-resources.png" descr="界面截图：教师：课程资源管理"/>
             <wp:cNvGraphicFramePr>
               <a:graphicFrameLocks xmlns:a="http://schemas.openxmlformats.org/drawingml/2006/main" noChangeAspect="1"/>
             </wp:cNvGraphicFramePr>
@@ -4227,7 +4221,7 @@
           <wp:inline distT="0" distB="0" distL="0" distR="0">
             <wp:extent cx="6191250" cy="4295775"/>
             <wp:effectExtent t="0" r="0" b="0" l="0"/>
-            <wp:docPr id="1" name="guide-27-teacher-task-create.png" descr="发布任务时要把题目、提交要求、截止时间和评分方式写清楚。" title="教师：创建任务表单"/>
+            <wp:docPr id="1" name="guide-27-teacher-task-create.png" descr="界面截图：教师：创建任务表单"/>
             <wp:cNvGraphicFramePr>
               <a:graphicFrameLocks xmlns:a="http://schemas.openxmlformats.org/drawingml/2006/main" noChangeAspect="1"/>
             </wp:cNvGraphicFramePr>
@@ -4377,7 +4371,7 @@
           <wp:inline distT="0" distB="0" distL="0" distR="0">
             <wp:extent cx="6191250" cy="4295775"/>
             <wp:effectExtent t="0" r="0" b="0" l="0"/>
-            <wp:docPr id="1" name="guide-07-teacher-task-analytics.png" descr="数据看板展示提交构成、正确率、题目分析和批改入口。" title="教师：任务数据看板"/>
+            <wp:docPr id="1" name="guide-07-teacher-task-analytics.png" descr="界面截图：教师：任务数据看板"/>
             <wp:cNvGraphicFramePr>
               <a:graphicFrameLocks xmlns:a="http://schemas.openxmlformats.org/drawingml/2006/main" noChangeAspect="1"/>
             </wp:cNvGraphicFramePr>
@@ -4546,7 +4540,7 @@
           <wp:inline distT="0" distB="0" distL="0" distR="0">
             <wp:extent cx="5905500" cy="6762750"/>
             <wp:effectExtent t="0" r="0" b="0" l="0"/>
-            <wp:docPr id="1" name="guide-19-teacher-grading-inbox-list.png" descr="这张图是关键：教师先看到该班所有应完成学生，再进入单个学生批改。" title="教师：按学生名单批改收件箱"/>
+            <wp:docPr id="1" name="guide-19-teacher-grading-inbox-list.png" descr="界面截图：教师：按学生名单批改收件箱"/>
             <wp:cNvGraphicFramePr>
               <a:graphicFrameLocks xmlns:a="http://schemas.openxmlformats.org/drawingml/2006/main" noChangeAspect="1"/>
             </wp:cNvGraphicFramePr>
@@ -4622,7 +4616,7 @@
           <wp:inline distT="0" distB="0" distL="0" distR="0">
             <wp:extent cx="6191250" cy="4295775"/>
             <wp:effectExtent t="0" r="0" b="0" l="0"/>
-            <wp:docPr id="1" name="guide-08-teacher-grading-roster.png" descr="进入学生后可逐题给分、写逐题评语和教师总评，保存后学生可查看结果。" title="教师：单个学生批改详情"/>
+            <wp:docPr id="1" name="guide-08-teacher-grading-roster.png" descr="界面截图：教师：单个学生批改详情"/>
             <wp:cNvGraphicFramePr>
               <a:graphicFrameLocks xmlns:a="http://schemas.openxmlformats.org/drawingml/2006/main" noChangeAspect="1"/>
             </wp:cNvGraphicFramePr>
@@ -4772,7 +4766,7 @@
           <wp:inline distT="0" distB="0" distL="0" distR="0">
             <wp:extent cx="6191250" cy="4295775"/>
             <wp:effectExtent t="0" r="0" b="0" l="0"/>
-            <wp:docPr id="1" name="guide-20-teacher-student-list.png" descr="教师可从学生列表进入学习档案或学生网盘。" title="教师：学生列表"/>
+            <wp:docPr id="1" name="guide-20-teacher-student-list.png" descr="界面截图：教师：学生列表"/>
             <wp:cNvGraphicFramePr>
               <a:graphicFrameLocks xmlns:a="http://schemas.openxmlformats.org/drawingml/2006/main" noChangeAspect="1"/>
             </wp:cNvGraphicFramePr>
@@ -4848,7 +4842,7 @@
           <wp:inline distT="0" distB="0" distL="0" distR="0">
             <wp:extent cx="6191250" cy="4295775"/>
             <wp:effectExtent t="0" r="0" b="0" l="0"/>
-            <wp:docPr id="1" name="guide-21-teacher-student-drive-modal.png" descr="教师可在弹窗中查看学生网盘目录、文件大小、预览和下载入口。" title="教师：查看学生网盘"/>
+            <wp:docPr id="1" name="guide-21-teacher-student-drive-modal.png" descr="界面截图：教师：查看学生网盘"/>
             <wp:cNvGraphicFramePr>
               <a:graphicFrameLocks xmlns:a="http://schemas.openxmlformats.org/drawingml/2006/main" noChangeAspect="1"/>
             </wp:cNvGraphicFramePr>
@@ -4925,13 +4919,7 @@
         <w:spacing w:after="50" w:before="40" w:line="310"/>
       </w:pPr>
       <w:r>
-        <w:rPr>
-          <w:rFonts w:ascii="Microsoft YaHei" w:cs="Microsoft YaHei" w:eastAsia="Microsoft YaHei" w:hAnsi="Microsoft YaHei"/>
-          <w:color w:val="172033"/>
-          <w:sz w:val="22"/>
-          <w:szCs w:val="22"/>
-        </w:rPr>
-        <w:t xml:space="preserve">考试管理：创建测验，设置试卷、考试时间和权重，查看学生完成情况并批改。</w:t>
+        <w:t>考试管理：创建试卷并设置起止时间和权重；学生开始后答案自动保存草稿；教师先按班级查看完整学生名单，再进入答卷批改、退回或复核。</w:t>
       </w:r>
     </w:p>
     <w:p>
@@ -4944,13 +4932,7 @@
         <w:spacing w:after="50" w:before="40" w:line="310"/>
       </w:pPr>
       <w:r>
-        <w:rPr>
-          <w:rFonts w:ascii="Microsoft YaHei" w:cs="Microsoft YaHei" w:eastAsia="Microsoft YaHei" w:hAnsi="Microsoft YaHei"/>
-          <w:color w:val="172033"/>
-          <w:sz w:val="22"/>
-          <w:szCs w:val="22"/>
-        </w:rPr>
-        <w:t xml:space="preserve">项目管理：发布项目要求、截止时间和评分权重；项目按个人提交，学生可在备注里写组员。</w:t>
+        <w:t>项目管理：发布个人项目要求、截止时间和评分维度；教师先按班级查看完整学生名单、提交时间、状态和修改次数，再进入项目评分。学生可在备注中写清协作成员。</w:t>
       </w:r>
     </w:p>
     <w:p>
@@ -5017,7 +4999,7 @@
           <wp:inline distT="0" distB="0" distL="0" distR="0">
             <wp:extent cx="6191250" cy="4295775"/>
             <wp:effectExtent t="0" r="0" b="0" l="0"/>
-            <wp:docPr id="1" name="guide-09-teacher-exams.png" descr="考试入口用于发布测验和查看考试完成情况。" title="教师：考试管理"/>
+            <wp:docPr id="1" name="guide-09-teacher-exams.png" descr="界面截图：教师：考试管理"/>
             <wp:cNvGraphicFramePr>
               <a:graphicFrameLocks xmlns:a="http://schemas.openxmlformats.org/drawingml/2006/main" noChangeAspect="1"/>
             </wp:cNvGraphicFramePr>
@@ -5093,7 +5075,7 @@
           <wp:inline distT="0" distB="0" distL="0" distR="0">
             <wp:extent cx="6191250" cy="4295775"/>
             <wp:effectExtent t="0" r="0" b="0" l="0"/>
-            <wp:docPr id="1" name="guide-10-teacher-projects.png" descr="项目入口用于管理项目提交、备注和评分。" title="教师：项目管理"/>
+            <wp:docPr id="1" name="guide-10-teacher-projects.png" descr="界面截图：教师：项目管理"/>
             <wp:cNvGraphicFramePr>
               <a:graphicFrameLocks xmlns:a="http://schemas.openxmlformats.org/drawingml/2006/main" noChangeAspect="1"/>
             </wp:cNvGraphicFramePr>
@@ -5169,7 +5151,7 @@
           <wp:inline distT="0" distB="0" distL="0" distR="0">
             <wp:extent cx="6191250" cy="4295775"/>
             <wp:effectExtent t="0" r="0" b="0" l="0"/>
-            <wp:docPr id="1" name="guide-28-teacher-stats.png" descr="数据分析页用于查看班级学习表现和阶段统计。" title="教师：数据分析"/>
+            <wp:docPr id="1" name="guide-28-teacher-stats.png" descr="界面截图：教师：数据分析"/>
             <wp:cNvGraphicFramePr>
               <a:graphicFrameLocks xmlns:a="http://schemas.openxmlformats.org/drawingml/2006/main" noChangeAspect="1"/>
             </wp:cNvGraphicFramePr>
@@ -5245,7 +5227,7 @@
           <wp:inline distT="0" distB="0" distL="0" distR="0">
             <wp:extent cx="6191250" cy="4295775"/>
             <wp:effectExtent t="0" r="0" b="0" l="0"/>
-            <wp:docPr id="1" name="guide-29-teacher-grade-export.png" descr="成绩导出用于生成学期总评表。" title="教师：成绩导出"/>
+            <wp:docPr id="1" name="guide-29-teacher-grade-export.png" descr="界面截图：教师：成绩导出"/>
             <wp:cNvGraphicFramePr>
               <a:graphicFrameLocks xmlns:a="http://schemas.openxmlformats.org/drawingml/2006/main" noChangeAspect="1"/>
             </wp:cNvGraphicFramePr>
@@ -5352,6 +5334,9 @@
         <w:gridCol w:w="4460"/>
       </w:tblGrid>
       <w:tr>
+        <w:trPr>
+          <w:tblHeader w:val="true"/>
+        </w:trPr>
         <w:tc>
           <w:tcPr>
             <w:tcW w:type="dxa" w:w="2000"/>
@@ -6093,7 +6078,7 @@
           <wp:inline distT="0" distB="0" distL="0" distR="0">
             <wp:extent cx="6191250" cy="4295775"/>
             <wp:effectExtent t="0" r="0" b="0" l="0"/>
-            <wp:docPr id="1" name="guide-11-student-home.png" descr="首页展示学生待办、近期任务和学习入口。" title="学生：首页"/>
+            <wp:docPr id="1" name="guide-11-student-home.png" descr="界面截图：学生：首页"/>
             <wp:cNvGraphicFramePr>
               <a:graphicFrameLocks xmlns:a="http://schemas.openxmlformats.org/drawingml/2006/main" noChangeAspect="1"/>
             </wp:cNvGraphicFramePr>
@@ -6262,7 +6247,7 @@
           <wp:inline distT="0" distB="0" distL="0" distR="0">
             <wp:extent cx="6191250" cy="4295775"/>
             <wp:effectExtent t="0" r="0" b="0" l="0"/>
-            <wp:docPr id="1" name="guide-12-student-courses.png" descr="学生只能看到自己班级关联的课程。" title="学生：我的课程"/>
+            <wp:docPr id="1" name="guide-12-student-courses.png" descr="界面截图：学生：我的课程"/>
             <wp:cNvGraphicFramePr>
               <a:graphicFrameLocks xmlns:a="http://schemas.openxmlformats.org/drawingml/2006/main" noChangeAspect="1"/>
             </wp:cNvGraphicFramePr>
@@ -6338,7 +6323,7 @@
           <wp:inline distT="0" distB="0" distL="0" distR="0">
             <wp:extent cx="6191250" cy="4295775"/>
             <wp:effectExtent t="0" r="0" b="0" l="0"/>
-            <wp:docPr id="1" name="guide-22-student-course-resources.png" descr="学生在课程资源中查看教师上传的资料和文件夹。" title="学生：课程资源"/>
+            <wp:docPr id="1" name="guide-22-student-course-resources.png" descr="界面截图：学生：课程资源"/>
             <wp:cNvGraphicFramePr>
               <a:graphicFrameLocks xmlns:a="http://schemas.openxmlformats.org/drawingml/2006/main" noChangeAspect="1"/>
             </wp:cNvGraphicFramePr>
@@ -6507,7 +6492,7 @@
           <wp:inline distT="0" distB="0" distL="0" distR="0">
             <wp:extent cx="6191250" cy="4295775"/>
             <wp:effectExtent t="0" r="0" b="0" l="0"/>
-            <wp:docPr id="1" name="guide-30-student-task-submit.png" descr="未提交学生会看到任务填写和提交入口。" title="学生：任务提交页"/>
+            <wp:docPr id="1" name="guide-30-student-task-submit.png" descr="界面截图：学生：任务提交页"/>
             <wp:cNvGraphicFramePr>
               <a:graphicFrameLocks xmlns:a="http://schemas.openxmlformats.org/drawingml/2006/main" noChangeAspect="1"/>
             </wp:cNvGraphicFramePr>
@@ -6657,7 +6642,7 @@
           <wp:inline distT="0" distB="0" distL="0" distR="0">
             <wp:extent cx="6191250" cy="4295775"/>
             <wp:effectExtent t="0" r="0" b="0" l="0"/>
-            <wp:docPr id="1" name="guide-14-student-task-result.png" descr="学生可以看到教师总评、逐题批改结果和维度评价。" title="学生：任务批改结果"/>
+            <wp:docPr id="1" name="guide-14-student-task-result.png" descr="界面截图：学生：任务批改结果"/>
             <wp:cNvGraphicFramePr>
               <a:graphicFrameLocks xmlns:a="http://schemas.openxmlformats.org/drawingml/2006/main" noChangeAspect="1"/>
             </wp:cNvGraphicFramePr>
@@ -6734,13 +6719,7 @@
         <w:spacing w:after="50" w:before="40" w:line="310"/>
       </w:pPr>
       <w:r>
-        <w:rPr>
-          <w:rFonts w:ascii="Microsoft YaHei" w:cs="Microsoft YaHei" w:eastAsia="Microsoft YaHei" w:hAnsi="Microsoft YaHei"/>
-          <w:color w:val="172033"/>
-          <w:sz w:val="22"/>
-          <w:szCs w:val="22"/>
-        </w:rPr>
-        <w:t xml:space="preserve">进入考试列表，按老师设置的时间参加考试。</w:t>
+        <w:t>进入考试列表，按老师设置的时间开始答题；系统约 1 秒自动保存草稿。提交后等待批改，教师退回时按原因修改重交，已批改时进入只读结果页查看成绩。</w:t>
       </w:r>
     </w:p>
     <w:p>
@@ -6753,13 +6732,7 @@
         <w:spacing w:after="50" w:before="40" w:line="310"/>
       </w:pPr>
       <w:r>
-        <w:rPr>
-          <w:rFonts w:ascii="Microsoft YaHei" w:cs="Microsoft YaHei" w:eastAsia="Microsoft YaHei" w:hAnsi="Microsoft YaHei"/>
-          <w:color w:val="172033"/>
-          <w:sz w:val="22"/>
-          <w:szCs w:val="22"/>
-        </w:rPr>
-        <w:t xml:space="preserve">进入项目列表，上传项目文件；如果有组员，在备注里写清姓名/学号和分工。</w:t>
+        <w:t>进入项目列表，上传个人项目文件并填写备注；如果有协作成员，在备注里写清姓名/学号和分工。已批改项目可打开只读详情，查看总分和各维度得分。</w:t>
       </w:r>
     </w:p>
     <w:p>
@@ -6807,7 +6780,7 @@
           <wp:inline distT="0" distB="0" distL="0" distR="0">
             <wp:extent cx="6191250" cy="4295775"/>
             <wp:effectExtent t="0" r="0" b="0" l="0"/>
-            <wp:docPr id="1" name="guide-25-student-exams.png" descr="学生从考试入口查看可参加的测验。" title="学生：考试列表"/>
+            <wp:docPr id="1" name="guide-25-student-exams.png" descr="界面截图：学生：考试列表"/>
             <wp:cNvGraphicFramePr>
               <a:graphicFrameLocks xmlns:a="http://schemas.openxmlformats.org/drawingml/2006/main" noChangeAspect="1"/>
             </wp:cNvGraphicFramePr>
@@ -6883,7 +6856,7 @@
           <wp:inline distT="0" distB="0" distL="0" distR="0">
             <wp:extent cx="6191250" cy="4295775"/>
             <wp:effectExtent t="0" r="0" b="0" l="0"/>
-            <wp:docPr id="1" name="guide-24-student-projects.png" descr="项目提交时可上传文件，并在备注中写清组员和分工。" title="学生：项目列表与备注要求"/>
+            <wp:docPr id="1" name="guide-24-student-projects.png" descr="界面截图：学生：项目列表与备注要求"/>
             <wp:cNvGraphicFramePr>
               <a:graphicFrameLocks xmlns:a="http://schemas.openxmlformats.org/drawingml/2006/main" noChangeAspect="1"/>
             </wp:cNvGraphicFramePr>
@@ -6959,7 +6932,7 @@
           <wp:inline distT="0" distB="0" distL="0" distR="0">
             <wp:extent cx="6191250" cy="4295775"/>
             <wp:effectExtent t="0" r="0" b="0" l="0"/>
-            <wp:docPr id="1" name="guide-17-student-evaluation.png" descr="学习评价汇总任务、考试和项目表现。" title="学生：学习评价"/>
+            <wp:docPr id="1" name="guide-17-student-evaluation.png" descr="界面截图：学生：学习评价"/>
             <wp:cNvGraphicFramePr>
               <a:graphicFrameLocks xmlns:a="http://schemas.openxmlformats.org/drawingml/2006/main" noChangeAspect="1"/>
             </wp:cNvGraphicFramePr>
@@ -7128,7 +7101,7 @@
           <wp:inline distT="0" distB="0" distL="0" distR="0">
             <wp:extent cx="6191250" cy="4295775"/>
             <wp:effectExtent t="0" r="0" b="0" l="0"/>
-            <wp:docPr id="1" name="guide-23-student-drive.png" descr="根目录可新建文件夹、上传文件或文件夹。" title="学生：我的网盘根目录"/>
+            <wp:docPr id="1" name="guide-23-student-drive.png" descr="界面截图：学生：我的网盘根目录"/>
             <wp:cNvGraphicFramePr>
               <a:graphicFrameLocks xmlns:a="http://schemas.openxmlformats.org/drawingml/2006/main" noChangeAspect="1"/>
             </wp:cNvGraphicFramePr>
@@ -7204,7 +7177,7 @@
           <wp:inline distT="0" distB="0" distL="0" distR="0">
             <wp:extent cx="6191250" cy="4295775"/>
             <wp:effectExtent t="0" r="0" b="0" l="0"/>
-            <wp:docPr id="1" name="guide-26-student-drive-folder.png" descr="进入文件夹后可以看到具体文件，并进行预览、下载或删除。" title="学生：网盘文件夹内文件"/>
+            <wp:docPr id="1" name="guide-26-student-drive-folder.png" descr="界面截图：学生：网盘文件夹内文件"/>
             <wp:cNvGraphicFramePr>
               <a:graphicFrameLocks xmlns:a="http://schemas.openxmlformats.org/drawingml/2006/main" noChangeAspect="1"/>
             </wp:cNvGraphicFramePr>
@@ -7295,6 +7268,9 @@
         <w:gridCol w:w="2660"/>
       </w:tblGrid>
       <w:tr>
+        <w:trPr>
+          <w:tblHeader w:val="true"/>
+        </w:trPr>
         <w:tc>
           <w:tcPr>
             <w:tcW w:type="dxa" w:w="1400"/>
@@ -8127,7 +8103,8 @@
     </w:p>
     <w:p>
       <w:pPr>
-        <w:pStyle w:val="Heading3"/>
+        <w:pStyle w:val="Heading2"/>
+        <w:keepNext/>
         <w:spacing w:after="70" w:before="180" w:line="310"/>
       </w:pPr>
       <w:r>
@@ -8163,7 +8140,8 @@
     </w:p>
     <w:p>
       <w:pPr>
-        <w:pStyle w:val="Heading3"/>
+        <w:pStyle w:val="Heading2"/>
+        <w:keepNext/>
         <w:spacing w:after="70" w:before="180" w:line="310"/>
       </w:pPr>
       <w:r>
@@ -8199,19 +8177,12 @@
     </w:p>
     <w:p>
       <w:pPr>
-        <w:pStyle w:val="Heading3"/>
+        <w:pStyle w:val="Heading2"/>
+        <w:keepNext/>
         <w:spacing w:after="70" w:before="180" w:line="310"/>
       </w:pPr>
       <w:r>
-        <w:rPr>
-          <w:rFonts w:ascii="Microsoft YaHei" w:cs="Microsoft YaHei" w:eastAsia="Microsoft YaHei" w:hAnsi="Microsoft YaHei"/>
-          <w:b/>
-          <w:bCs/>
-          <w:color w:val="172033"/>
-          <w:sz w:val="23"/>
-          <w:szCs w:val="23"/>
-        </w:rPr>
-        <w:t xml:space="preserve">学生看不到批改详情</w:t>
+        <w:t>学生看不到任务、考试或项目批改详情</w:t>
       </w:r>
     </w:p>
     <w:p>
@@ -8224,18 +8195,13 @@
         <w:spacing w:after="30" w:before="30" w:line="310"/>
       </w:pPr>
       <w:r>
-        <w:rPr>
-          <w:rFonts w:ascii="Microsoft YaHei" w:cs="Microsoft YaHei" w:eastAsia="Microsoft YaHei" w:hAnsi="Microsoft YaHei"/>
-          <w:color w:val="172033"/>
-          <w:sz w:val="22"/>
-          <w:szCs w:val="22"/>
-        </w:rPr>
-        <w:t xml:space="preserve">确认学生已提交；确认教师已保存批改；保存后学生刷新任务结果页。</w:t>
-      </w:r>
-    </w:p>
-    <w:p>
-      <w:pPr>
-        <w:pStyle w:val="Heading3"/>
+        <w:t>确认学生已正式提交且教师已保存批改；任务从结果页查看，考试点击“查看结果”，项目点击“查看批改详情”。若教师已退回，学生会先看到退回原因并继续修改。</w:t>
+      </w:r>
+    </w:p>
+    <w:p>
+      <w:pPr>
+        <w:pStyle w:val="Heading2"/>
+        <w:keepNext/>
         <w:spacing w:after="70" w:before="180" w:line="310"/>
       </w:pPr>
       <w:r>
@@ -8271,7 +8237,8 @@
     </w:p>
     <w:p>
       <w:pPr>
-        <w:pStyle w:val="Heading3"/>
+        <w:pStyle w:val="Heading2"/>
+        <w:keepNext/>
         <w:spacing w:after="70" w:before="180" w:line="310"/>
       </w:pPr>
       <w:r>
@@ -8307,7 +8274,8 @@
     </w:p>
     <w:p>
       <w:pPr>
-        <w:pStyle w:val="Heading3"/>
+        <w:pStyle w:val="Heading2"/>
+        <w:keepNext/>
         <w:spacing w:after="70" w:before="180" w:line="310"/>
       </w:pPr>
       <w:r>
@@ -8332,13 +8300,823 @@
         <w:spacing w:after="30" w:before="30" w:line="310"/>
       </w:pPr>
       <w:r>
-        <w:rPr>
-          <w:rFonts w:ascii="Microsoft YaHei" w:cs="Microsoft YaHei" w:eastAsia="Microsoft YaHei" w:hAnsi="Microsoft YaHei"/>
-          <w:color w:val="172033"/>
-          <w:sz w:val="22"/>
-          <w:szCs w:val="22"/>
-        </w:rPr>
-        <w:t xml:space="preserve">本文档截图来自真实演练场景 0614111133，包含 3 名学生：两名已提交并批改，一名未提交。</w:t>
+        <w:t>本文档原有截图来自完整学期演练；新增截图来自 0811134739 场景。该场景在 Docker 后端中模拟 30 名学生并发提交，并验证任务、考试、项目、课程资源和学生网盘。</w:t>
+      </w:r>
+    </w:p>
+    <w:p>
+      <w:r>
+        <w:br w:type="page"/>
+      </w:r>
+    </w:p>
+    <w:p>
+      <w:pPr>
+        <w:pStyle w:val="Heading1"/>
+        <w:keepNext/>
+      </w:pPr>
+      <w:r>
+        <w:t>八、2026-08-11 关键流程实测</w:t>
+      </w:r>
+    </w:p>
+    <w:p>
+      <w:pPr>
+        <w:spacing w:after="200"/>
+      </w:pPr>
+      <w:r>
+        <w:rPr>
+          <w:b/>
+          <w:color w:val="166534"/>
+        </w:rPr>
+        <w:t>本章用于快速核对最新页面和业务规则。</w:t>
+      </w:r>
+      <w:r>
+        <w:t xml:space="preserve"> 后端运行在 Docker 中；无 Redis 和启用 Redis 两种模式均完成核心流程验证。</w:t>
+      </w:r>
+    </w:p>
+    <w:p>
+      <w:pPr>
+        <w:pStyle w:val="Heading2"/>
+      </w:pPr>
+      <w:r>
+        <w:t>8.1 教师工作台与任务待批改</w:t>
+      </w:r>
+    </w:p>
+    <w:p>
+      <w:r>
+        <w:rPr>
+          <w:b/>
+          <w:color w:val="166534"/>
+        </w:rPr>
+        <w:t xml:space="preserve">步骤 1　</w:t>
+      </w:r>
+      <w:r>
+        <w:t>教师登录后先看待评分、即将截止和近期提交，确认当天需要处理的内容。</w:t>
+      </w:r>
+    </w:p>
+    <w:p>
+      <w:r>
+        <w:rPr>
+          <w:b/>
+          <w:color w:val="166534"/>
+        </w:rPr>
+        <w:t xml:space="preserve">步骤 2　</w:t>
+      </w:r>
+      <w:r>
+        <w:t>点击“去评分”进入对应任务；课堂中可进入数据看板实时观察提交进度。</w:t>
+      </w:r>
+    </w:p>
+    <w:p>
+      <w:pPr>
+        <w:keepNext/>
+      </w:pPr>
+      <w:r>
+        <w:drawing>
+          <wp:inline xmlns:a="http://schemas.openxmlformats.org/drawingml/2006/main" xmlns:pic="http://schemas.openxmlformats.org/drawingml/2006/picture">
+            <wp:extent cx="6645910" cy="4155443"/>
+            <wp:docPr id="2" name="Picture 2" descr="界面截图：图 8-1  教师工作台：待评分与近期提交"/>
+            <wp:cNvGraphicFramePr>
+              <a:graphicFrameLocks noChangeAspect="1"/>
+            </wp:cNvGraphicFramePr>
+            <a:graphic>
+              <a:graphicData uri="http://schemas.openxmlformats.org/drawingml/2006/picture">
+                <pic:pic>
+                  <pic:nvPicPr>
+                    <pic:cNvPr id="0" name="01-teacher-dashboard.png"/>
+                    <pic:cNvPicPr/>
+                  </pic:nvPicPr>
+                  <pic:blipFill>
+                    <a:blip r:embed="rId39"/>
+                    <a:stretch>
+                      <a:fillRect/>
+                    </a:stretch>
+                  </pic:blipFill>
+                  <pic:spPr>
+                    <a:xfrm>
+                      <a:off x="0" y="0"/>
+                      <a:ext cx="6645910" cy="4155443"/>
+                    </a:xfrm>
+                    <a:prstGeom prst="rect"/>
+                  </pic:spPr>
+                </pic:pic>
+              </a:graphicData>
+            </a:graphic>
+          </wp:inline>
+        </w:drawing>
+      </w:r>
+    </w:p>
+    <w:p>
+      <w:pPr>
+        <w:spacing w:after="160"/>
+        <w:jc w:val="center"/>
+      </w:pPr>
+      <w:r>
+        <w:rPr>
+          <w:i/>
+          <w:color w:val="57534E"/>
+          <w:sz w:val="18"/>
+        </w:rPr>
+        <w:t>图 8-1  教师工作台：待评分与近期提交</w:t>
+      </w:r>
+    </w:p>
+    <w:p>
+      <w:r>
+        <w:br w:type="page"/>
+      </w:r>
+    </w:p>
+    <w:p>
+      <w:pPr>
+        <w:pStyle w:val="Heading2"/>
+      </w:pPr>
+      <w:r>
+        <w:t>8.2 项目先看完整学生名单</w:t>
+      </w:r>
+    </w:p>
+    <w:p>
+      <w:r>
+        <w:rPr>
+          <w:b/>
+          <w:color w:val="166534"/>
+        </w:rPr>
+        <w:t xml:space="preserve">步骤 1　</w:t>
+      </w:r>
+      <w:r>
+        <w:t>进入“考试与项目 &gt; 项目”，选择项目并打开提交名单。</w:t>
+      </w:r>
+    </w:p>
+    <w:p>
+      <w:r>
+        <w:rPr>
+          <w:b/>
+          <w:color w:val="166534"/>
+        </w:rPr>
+        <w:t xml:space="preserve">步骤 2　</w:t>
+      </w:r>
+      <w:r>
+        <w:t>使用姓名或学号搜索，也可按班级和状态筛选。名单显示状态、提交时间、成绩和修改次数。</w:t>
+      </w:r>
+    </w:p>
+    <w:p>
+      <w:r>
+        <w:rPr>
+          <w:b/>
+          <w:color w:val="166534"/>
+        </w:rPr>
+        <w:t xml:space="preserve">步骤 3　</w:t>
+      </w:r>
+      <w:r>
+        <w:t>已批改学生进入只读详情；未提交学生保留在名单中，避免漏查。</w:t>
+      </w:r>
+    </w:p>
+    <w:p>
+      <w:pPr>
+        <w:keepNext/>
+      </w:pPr>
+      <w:r>
+        <w:drawing>
+          <wp:inline xmlns:a="http://schemas.openxmlformats.org/drawingml/2006/main" xmlns:pic="http://schemas.openxmlformats.org/drawingml/2006/picture">
+            <wp:extent cx="6645910" cy="4153694"/>
+            <wp:docPr id="3" name="Picture 3" descr="界面截图：图 8-2  项目批改名单：按学生搜索并查看批改状态"/>
+            <wp:cNvGraphicFramePr>
+              <a:graphicFrameLocks noChangeAspect="1"/>
+            </wp:cNvGraphicFramePr>
+            <a:graphic>
+              <a:graphicData uri="http://schemas.openxmlformats.org/drawingml/2006/picture">
+                <pic:pic>
+                  <pic:nvPicPr>
+                    <pic:cNvPr id="0" name="02-project-roster.png"/>
+                    <pic:cNvPicPr/>
+                  </pic:nvPicPr>
+                  <pic:blipFill>
+                    <a:blip r:embed="rId40"/>
+                    <a:stretch>
+                      <a:fillRect/>
+                    </a:stretch>
+                  </pic:blipFill>
+                  <pic:spPr>
+                    <a:xfrm>
+                      <a:off x="0" y="0"/>
+                      <a:ext cx="6645910" cy="4153694"/>
+                    </a:xfrm>
+                    <a:prstGeom prst="rect"/>
+                  </pic:spPr>
+                </pic:pic>
+              </a:graphicData>
+            </a:graphic>
+          </wp:inline>
+        </w:drawing>
+      </w:r>
+    </w:p>
+    <w:p>
+      <w:pPr>
+        <w:spacing w:after="160"/>
+        <w:jc w:val="center"/>
+      </w:pPr>
+      <w:r>
+        <w:rPr>
+          <w:i/>
+          <w:color w:val="57534E"/>
+          <w:sz w:val="18"/>
+        </w:rPr>
+        <w:t>图 8-2  项目批改名单：按学生搜索并查看批改状态</w:t>
+      </w:r>
+    </w:p>
+    <w:p>
+      <w:r>
+        <w:br w:type="page"/>
+      </w:r>
+    </w:p>
+    <w:p>
+      <w:pPr>
+        <w:pStyle w:val="Heading2"/>
+      </w:pPr>
+      <w:r>
+        <w:t>8.3 教师查看项目批改详情</w:t>
+      </w:r>
+    </w:p>
+    <w:p>
+      <w:r>
+        <w:rPr>
+          <w:b/>
+          <w:color w:val="166534"/>
+        </w:rPr>
+        <w:t xml:space="preserve">步骤 1　</w:t>
+      </w:r>
+      <w:r>
+        <w:t>点击学生行进入详情，核对姓名、学号、班级、提交状态和总分。</w:t>
+      </w:r>
+    </w:p>
+    <w:p>
+      <w:r>
+        <w:rPr>
+          <w:b/>
+          <w:color w:val="166534"/>
+        </w:rPr>
+        <w:t xml:space="preserve">步骤 2　</w:t>
+      </w:r>
+      <w:r>
+        <w:t>查看学生备注/组员说明、提交文件以及信息意识、计算思维、数字化学习与创新、信息社会责任四个维度得分。</w:t>
+      </w:r>
+    </w:p>
+    <w:p>
+      <w:r>
+        <w:rPr>
+          <w:b/>
+          <w:color w:val="166534"/>
+        </w:rPr>
+        <w:t xml:space="preserve">步骤 3　</w:t>
+      </w:r>
+      <w:r>
+        <w:t>需要修改成绩时点击“重新批改”；需要学生补充材料时点击“退回修改”并填写原因。</w:t>
+      </w:r>
+    </w:p>
+    <w:p>
+      <w:pPr>
+        <w:keepNext/>
+      </w:pPr>
+      <w:r>
+        <w:drawing>
+          <wp:inline xmlns:a="http://schemas.openxmlformats.org/drawingml/2006/main" xmlns:pic="http://schemas.openxmlformats.org/drawingml/2006/picture">
+            <wp:extent cx="6645910" cy="4153694"/>
+            <wp:docPr id="4" name="Picture 4" descr="界面截图：图 8-3  教师项目详情：总分、备注和维度得分"/>
+            <wp:cNvGraphicFramePr>
+              <a:graphicFrameLocks noChangeAspect="1"/>
+            </wp:cNvGraphicFramePr>
+            <a:graphic>
+              <a:graphicData uri="http://schemas.openxmlformats.org/drawingml/2006/picture">
+                <pic:pic>
+                  <pic:nvPicPr>
+                    <pic:cNvPr id="0" name="03-teacher-project-grading-detail.png"/>
+                    <pic:cNvPicPr/>
+                  </pic:nvPicPr>
+                  <pic:blipFill>
+                    <a:blip r:embed="rId41"/>
+                    <a:stretch>
+                      <a:fillRect/>
+                    </a:stretch>
+                  </pic:blipFill>
+                  <pic:spPr>
+                    <a:xfrm>
+                      <a:off x="0" y="0"/>
+                      <a:ext cx="6645910" cy="4153694"/>
+                    </a:xfrm>
+                    <a:prstGeom prst="rect"/>
+                  </pic:spPr>
+                </pic:pic>
+              </a:graphicData>
+            </a:graphic>
+          </wp:inline>
+        </w:drawing>
+      </w:r>
+    </w:p>
+    <w:p>
+      <w:pPr>
+        <w:spacing w:after="160"/>
+        <w:jc w:val="center"/>
+      </w:pPr>
+      <w:r>
+        <w:rPr>
+          <w:i/>
+          <w:color w:val="57534E"/>
+          <w:sz w:val="18"/>
+        </w:rPr>
+        <w:t>图 8-3  教师项目详情：总分、备注和维度得分</w:t>
+      </w:r>
+    </w:p>
+    <w:p>
+      <w:r>
+        <w:br w:type="page"/>
+      </w:r>
+    </w:p>
+    <w:p>
+      <w:pPr>
+        <w:pStyle w:val="Heading2"/>
+      </w:pPr>
+      <w:r>
+        <w:t>8.4 学生查看项目批改详情</w:t>
+      </w:r>
+    </w:p>
+    <w:p>
+      <w:r>
+        <w:rPr>
+          <w:b/>
+          <w:color w:val="166534"/>
+        </w:rPr>
+        <w:t xml:space="preserve">步骤 1　</w:t>
+      </w:r>
+      <w:r>
+        <w:t>进入“待完成 &gt; 项目”，找到状态为“已批改”的项目。</w:t>
+      </w:r>
+    </w:p>
+    <w:p>
+      <w:r>
+        <w:rPr>
+          <w:b/>
+          <w:color w:val="166534"/>
+        </w:rPr>
+        <w:t xml:space="preserve">步骤 2　</w:t>
+      </w:r>
+      <w:r>
+        <w:t>点击“查看批改详情”，核对总分、四个维度得分和原提交备注。</w:t>
+      </w:r>
+    </w:p>
+    <w:p>
+      <w:r>
+        <w:rPr>
+          <w:b/>
+          <w:color w:val="166534"/>
+        </w:rPr>
+        <w:t xml:space="preserve">步骤 3　</w:t>
+      </w:r>
+      <w:r>
+        <w:t>已批改内容为只读；只有教师退回后才能再次提交。</w:t>
+      </w:r>
+    </w:p>
+    <w:p>
+      <w:pPr>
+        <w:keepNext/>
+      </w:pPr>
+      <w:r>
+        <w:drawing>
+          <wp:inline xmlns:a="http://schemas.openxmlformats.org/drawingml/2006/main" xmlns:pic="http://schemas.openxmlformats.org/drawingml/2006/picture">
+            <wp:extent cx="6645910" cy="4153694"/>
+            <wp:docPr id="5" name="Picture 5" descr="界面截图：图 8-4  学生项目详情：批改结果和组员说明"/>
+            <wp:cNvGraphicFramePr>
+              <a:graphicFrameLocks noChangeAspect="1"/>
+            </wp:cNvGraphicFramePr>
+            <a:graphic>
+              <a:graphicData uri="http://schemas.openxmlformats.org/drawingml/2006/picture">
+                <pic:pic>
+                  <pic:nvPicPr>
+                    <pic:cNvPr id="0" name="04-student-project-grading-detail.png"/>
+                    <pic:cNvPicPr/>
+                  </pic:nvPicPr>
+                  <pic:blipFill>
+                    <a:blip r:embed="rId42"/>
+                    <a:stretch>
+                      <a:fillRect/>
+                    </a:stretch>
+                  </pic:blipFill>
+                  <pic:spPr>
+                    <a:xfrm>
+                      <a:off x="0" y="0"/>
+                      <a:ext cx="6645910" cy="4153694"/>
+                    </a:xfrm>
+                    <a:prstGeom prst="rect"/>
+                  </pic:spPr>
+                </pic:pic>
+              </a:graphicData>
+            </a:graphic>
+          </wp:inline>
+        </w:drawing>
+      </w:r>
+    </w:p>
+    <w:p>
+      <w:pPr>
+        <w:spacing w:after="160"/>
+        <w:jc w:val="center"/>
+      </w:pPr>
+      <w:r>
+        <w:rPr>
+          <w:i/>
+          <w:color w:val="57534E"/>
+          <w:sz w:val="18"/>
+        </w:rPr>
+        <w:t>图 8-4  学生项目详情：批改结果和组员说明</w:t>
+      </w:r>
+    </w:p>
+    <w:p>
+      <w:r>
+        <w:br w:type="page"/>
+      </w:r>
+    </w:p>
+    <w:p>
+      <w:pPr>
+        <w:pStyle w:val="Heading2"/>
+      </w:pPr>
+      <w:r>
+        <w:t>8.5 学生查看课程资源</w:t>
+      </w:r>
+    </w:p>
+    <w:p>
+      <w:r>
+        <w:rPr>
+          <w:b/>
+          <w:color w:val="166534"/>
+        </w:rPr>
+        <w:t xml:space="preserve">步骤 1　</w:t>
+      </w:r>
+      <w:r>
+        <w:t>从“我的课程”进入课程，打开“课程资源”。</w:t>
+      </w:r>
+    </w:p>
+    <w:p>
+      <w:r>
+        <w:rPr>
+          <w:b/>
+          <w:color w:val="166534"/>
+        </w:rPr>
+        <w:t xml:space="preserve">步骤 2　</w:t>
+      </w:r>
+      <w:r>
+        <w:t>展开教师建立的资料文件夹，点击眼睛图标预览，点击下载图标保存文件。</w:t>
+      </w:r>
+    </w:p>
+    <w:p>
+      <w:r>
+        <w:rPr>
+          <w:b/>
+          <w:color w:val="166534"/>
+        </w:rPr>
+        <w:t xml:space="preserve">步骤 3　</w:t>
+      </w:r>
+      <w:r>
+        <w:t>课程资源由教师维护，学生只读；个人作品请放在“我的网盘”。</w:t>
+      </w:r>
+    </w:p>
+    <w:p>
+      <w:pPr>
+        <w:keepNext/>
+      </w:pPr>
+      <w:r>
+        <w:drawing>
+          <wp:inline xmlns:a="http://schemas.openxmlformats.org/drawingml/2006/main" xmlns:pic="http://schemas.openxmlformats.org/drawingml/2006/picture">
+            <wp:extent cx="6645910" cy="4153694"/>
+            <wp:docPr id="6" name="Picture 6" descr="界面截图：图 8-5  学生课程资源：目录、文件、预览与下载"/>
+            <wp:cNvGraphicFramePr>
+              <a:graphicFrameLocks noChangeAspect="1"/>
+            </wp:cNvGraphicFramePr>
+            <a:graphic>
+              <a:graphicData uri="http://schemas.openxmlformats.org/drawingml/2006/picture">
+                <pic:pic>
+                  <pic:nvPicPr>
+                    <pic:cNvPr id="0" name="05-student-course-resources.png"/>
+                    <pic:cNvPicPr/>
+                  </pic:nvPicPr>
+                  <pic:blipFill>
+                    <a:blip r:embed="rId43"/>
+                    <a:stretch>
+                      <a:fillRect/>
+                    </a:stretch>
+                  </pic:blipFill>
+                  <pic:spPr>
+                    <a:xfrm>
+                      <a:off x="0" y="0"/>
+                      <a:ext cx="6645910" cy="4153694"/>
+                    </a:xfrm>
+                    <a:prstGeom prst="rect"/>
+                  </pic:spPr>
+                </pic:pic>
+              </a:graphicData>
+            </a:graphic>
+          </wp:inline>
+        </w:drawing>
+      </w:r>
+    </w:p>
+    <w:p>
+      <w:pPr>
+        <w:spacing w:after="160"/>
+        <w:jc w:val="center"/>
+      </w:pPr>
+      <w:r>
+        <w:rPr>
+          <w:i/>
+          <w:color w:val="57534E"/>
+          <w:sz w:val="18"/>
+        </w:rPr>
+        <w:t>图 8-5  学生课程资源：目录、文件、预览与下载</w:t>
+      </w:r>
+    </w:p>
+    <w:p>
+      <w:r>
+        <w:br w:type="page"/>
+      </w:r>
+    </w:p>
+    <w:p>
+      <w:pPr>
+        <w:pStyle w:val="Heading2"/>
+      </w:pPr>
+      <w:r>
+        <w:t>8.6 学生使用个人网盘</w:t>
+      </w:r>
+    </w:p>
+    <w:p>
+      <w:r>
+        <w:rPr>
+          <w:b/>
+          <w:color w:val="166534"/>
+        </w:rPr>
+        <w:t xml:space="preserve">步骤 1　</w:t>
+      </w:r>
+      <w:r>
+        <w:t>进入“我的网盘”，可新建文件夹、上传文件或上传整个文件夹。</w:t>
+      </w:r>
+    </w:p>
+    <w:p>
+      <w:r>
+        <w:rPr>
+          <w:b/>
+          <w:color w:val="166534"/>
+        </w:rPr>
+        <w:t xml:space="preserve">步骤 2　</w:t>
+      </w:r>
+      <w:r>
+        <w:t>使用搜索框定位文件；右侧图标依次用于下载、预览和删除。</w:t>
+      </w:r>
+    </w:p>
+    <w:p>
+      <w:r>
+        <w:rPr>
+          <w:b/>
+          <w:color w:val="166534"/>
+        </w:rPr>
+        <w:t xml:space="preserve">步骤 3　</w:t>
+      </w:r>
+      <w:r>
+        <w:t>学生只能访问自己的网盘；任课教师仅能查看所带班级学生的网盘。</w:t>
+      </w:r>
+    </w:p>
+    <w:p>
+      <w:pPr>
+        <w:keepNext/>
+      </w:pPr>
+      <w:r>
+        <w:drawing>
+          <wp:inline xmlns:a="http://schemas.openxmlformats.org/drawingml/2006/main" xmlns:pic="http://schemas.openxmlformats.org/drawingml/2006/picture">
+            <wp:extent cx="6645910" cy="4153694"/>
+            <wp:docPr id="7" name="Picture 7" descr="界面截图：图 8-6  学生网盘：文件、文件夹与常用操作"/>
+            <wp:cNvGraphicFramePr>
+              <a:graphicFrameLocks noChangeAspect="1"/>
+            </wp:cNvGraphicFramePr>
+            <a:graphic>
+              <a:graphicData uri="http://schemas.openxmlformats.org/drawingml/2006/picture">
+                <pic:pic>
+                  <pic:nvPicPr>
+                    <pic:cNvPr id="0" name="06-student-drive.png"/>
+                    <pic:cNvPicPr/>
+                  </pic:nvPicPr>
+                  <pic:blipFill>
+                    <a:blip r:embed="rId44"/>
+                    <a:stretch>
+                      <a:fillRect/>
+                    </a:stretch>
+                  </pic:blipFill>
+                  <pic:spPr>
+                    <a:xfrm>
+                      <a:off x="0" y="0"/>
+                      <a:ext cx="6645910" cy="4153694"/>
+                    </a:xfrm>
+                    <a:prstGeom prst="rect"/>
+                  </pic:spPr>
+                </pic:pic>
+              </a:graphicData>
+            </a:graphic>
+          </wp:inline>
+        </w:drawing>
+      </w:r>
+    </w:p>
+    <w:p>
+      <w:pPr>
+        <w:spacing w:after="160"/>
+        <w:jc w:val="center"/>
+      </w:pPr>
+      <w:r>
+        <w:rPr>
+          <w:i/>
+          <w:color w:val="57534E"/>
+          <w:sz w:val="18"/>
+        </w:rPr>
+        <w:t>图 8-6  学生网盘：文件、文件夹与常用操作</w:t>
+      </w:r>
+    </w:p>
+    <w:p>
+      <w:r>
+        <w:br w:type="page"/>
+      </w:r>
+    </w:p>
+    <w:p>
+      <w:pPr>
+        <w:pStyle w:val="Heading2"/>
+      </w:pPr>
+      <w:r>
+        <w:t>8.7 学生查看考试结果</w:t>
+      </w:r>
+    </w:p>
+    <w:p>
+      <w:r>
+        <w:rPr>
+          <w:b/>
+          <w:color w:val="166534"/>
+        </w:rPr>
+        <w:t xml:space="preserve">步骤 1　</w:t>
+      </w:r>
+      <w:r>
+        <w:t>进入“待完成 &gt; 考试”，已批改考试显示成绩和“查看结果”按钮。</w:t>
+      </w:r>
+    </w:p>
+    <w:p>
+      <w:r>
+        <w:rPr>
+          <w:b/>
+          <w:color w:val="166534"/>
+        </w:rPr>
+        <w:t xml:space="preserve">步骤 2　</w:t>
+      </w:r>
+      <w:r>
+        <w:t>结果弹窗显示“已批改”和成绩，答案保持只读，不再显示倒计时或草稿保存状态。</w:t>
+      </w:r>
+    </w:p>
+    <w:p>
+      <w:r>
+        <w:rPr>
+          <w:b/>
+          <w:color w:val="166534"/>
+        </w:rPr>
+        <w:t xml:space="preserve">步骤 3　</w:t>
+      </w:r>
+      <w:r>
+        <w:t>教师退回且考试未截止时，学生会看到退回原因并可继续修改。</w:t>
+      </w:r>
+    </w:p>
+    <w:p>
+      <w:pPr>
+        <w:keepNext/>
+      </w:pPr>
+      <w:r>
+        <w:drawing>
+          <wp:inline xmlns:a="http://schemas.openxmlformats.org/drawingml/2006/main" xmlns:pic="http://schemas.openxmlformats.org/drawingml/2006/picture">
+            <wp:extent cx="6645910" cy="4153694"/>
+            <wp:docPr id="8" name="Picture 8" descr="界面截图：图 8-7  学生考试只读结果：成绩和作答内容"/>
+            <wp:cNvGraphicFramePr>
+              <a:graphicFrameLocks noChangeAspect="1"/>
+            </wp:cNvGraphicFramePr>
+            <a:graphic>
+              <a:graphicData uri="http://schemas.openxmlformats.org/drawingml/2006/picture">
+                <pic:pic>
+                  <pic:nvPicPr>
+                    <pic:cNvPr id="0" name="07-student-exam-result.png"/>
+                    <pic:cNvPicPr/>
+                  </pic:nvPicPr>
+                  <pic:blipFill>
+                    <a:blip r:embed="rId45"/>
+                    <a:stretch>
+                      <a:fillRect/>
+                    </a:stretch>
+                  </pic:blipFill>
+                  <pic:spPr>
+                    <a:xfrm>
+                      <a:off x="0" y="0"/>
+                      <a:ext cx="6645910" cy="4153694"/>
+                    </a:xfrm>
+                    <a:prstGeom prst="rect"/>
+                  </pic:spPr>
+                </pic:pic>
+              </a:graphicData>
+            </a:graphic>
+          </wp:inline>
+        </w:drawing>
+      </w:r>
+    </w:p>
+    <w:p>
+      <w:pPr>
+        <w:spacing w:after="160"/>
+        <w:jc w:val="center"/>
+      </w:pPr>
+      <w:r>
+        <w:rPr>
+          <w:i/>
+          <w:color w:val="57534E"/>
+          <w:sz w:val="18"/>
+        </w:rPr>
+        <w:t>图 8-7  学生考试只读结果：成绩和作答内容</w:t>
+      </w:r>
+    </w:p>
+    <w:p>
+      <w:r>
+        <w:br w:type="page"/>
+      </w:r>
+    </w:p>
+    <w:p>
+      <w:pPr>
+        <w:pStyle w:val="Heading2"/>
+      </w:pPr>
+      <w:r>
+        <w:t>8.8 手机端使用</w:t>
+      </w:r>
+    </w:p>
+    <w:p>
+      <w:r>
+        <w:rPr>
+          <w:b/>
+          <w:color w:val="166534"/>
+        </w:rPr>
+        <w:t xml:space="preserve">步骤 1　</w:t>
+      </w:r>
+      <w:r>
+        <w:t>手机端通过左上角菜单按钮打开导航，课程和学期筛选改为单列排列。</w:t>
+      </w:r>
+    </w:p>
+    <w:p>
+      <w:r>
+        <w:rPr>
+          <w:b/>
+          <w:color w:val="166534"/>
+        </w:rPr>
+        <w:t xml:space="preserve">步骤 2　</w:t>
+      </w:r>
+      <w:r>
+        <w:t>页面不得横向滚动；项目和考试主操作按钮的触控高度不小于 44 像素。</w:t>
+      </w:r>
+    </w:p>
+    <w:p>
+      <w:pPr>
+        <w:keepNext/>
+      </w:pPr>
+      <w:r>
+        <w:drawing>
+          <wp:inline xmlns:a="http://schemas.openxmlformats.org/drawingml/2006/main" xmlns:pic="http://schemas.openxmlformats.org/drawingml/2006/picture">
+            <wp:extent cx="2367743" cy="5120640"/>
+            <wp:docPr id="9" name="Picture 9" descr="界面截图：图 8-8  手机端项目页面"/>
+            <wp:cNvGraphicFramePr>
+              <a:graphicFrameLocks noChangeAspect="1"/>
+            </wp:cNvGraphicFramePr>
+            <a:graphic>
+              <a:graphicData uri="http://schemas.openxmlformats.org/drawingml/2006/picture">
+                <pic:pic>
+                  <pic:nvPicPr>
+                    <pic:cNvPr id="0" name="08-student-project-mobile.png"/>
+                    <pic:cNvPicPr/>
+                  </pic:nvPicPr>
+                  <pic:blipFill>
+                    <a:blip r:embed="rId46"/>
+                    <a:stretch>
+                      <a:fillRect/>
+                    </a:stretch>
+                  </pic:blipFill>
+                  <pic:spPr>
+                    <a:xfrm>
+                      <a:off x="0" y="0"/>
+                      <a:ext cx="2367743" cy="5120640"/>
+                    </a:xfrm>
+                    <a:prstGeom prst="rect"/>
+                  </pic:spPr>
+                </pic:pic>
+              </a:graphicData>
+            </a:graphic>
+          </wp:inline>
+        </w:drawing>
+      </w:r>
+    </w:p>
+    <w:p>
+      <w:pPr>
+        <w:spacing w:after="160"/>
+        <w:jc w:val="center"/>
+      </w:pPr>
+      <w:r>
+        <w:rPr>
+          <w:i/>
+          <w:color w:val="57534E"/>
+          <w:sz w:val="18"/>
+        </w:rPr>
+        <w:t>图 8-8  手机端项目页面</w:t>
       </w:r>
     </w:p>
     <w:sectPr>

</xml_diff>